<commit_message>
polish chapter 6 wording
</commit_message>
<xml_diff>
--- a/第6章-从聊天工具到数字员工.docx
+++ b/第6章-从聊天工具到数字员工.docx
@@ -76,51 +76,51 @@
           <w:sz w:val="24"/>
           <w:sz-cs w:val="24"/>
         </w:rPr>
-        <w:t xml:space="preserve">写不出文案时，问它；理不清思路时，问它；做方案卡住时，问它；连一封邮件、一段口播稿、一条朋友圈，都可以先交给它润一遍。某种意义上，大模型已经成了很多人的“外脑”。它能解释概念，能提供建议，能辅助思考，也能在很多日常场景里帮人节省时间。</w:t>
-      </w:r>
-    </w:p>
-    <w:p>
-      <w:pPr/>
-      <w:r>
-        <w:rPr>
-          <w:rFonts w:ascii="Helvetica Light" w:hAnsi="Helvetica Light" w:cs="Helvetica Light"/>
-          <w:sz w:val="24"/>
-          <w:sz-cs w:val="24"/>
-        </w:rPr>
-        <w:t xml:space="preserve"/>
-      </w:r>
-    </w:p>
-    <w:p>
-      <w:pPr/>
-      <w:r>
-        <w:rPr>
-          <w:rFonts w:ascii="Helvetica Light" w:hAnsi="Helvetica Light" w:cs="Helvetica Light"/>
-          <w:sz w:val="24"/>
-          <w:sz-cs w:val="24"/>
-        </w:rPr>
-        <w:t xml:space="preserve">但如果认真看一眼就会发现，过去大多数 AI 的能力，依然主要停留在“回答”这一层。</w:t>
-      </w:r>
-    </w:p>
-    <w:p>
-      <w:pPr/>
-      <w:r>
-        <w:rPr>
-          <w:rFonts w:ascii="Helvetica Light" w:hAnsi="Helvetica Light" w:cs="Helvetica Light"/>
-          <w:sz w:val="24"/>
-          <w:sz-cs w:val="24"/>
-        </w:rPr>
-        <w:t xml:space="preserve"/>
-      </w:r>
-    </w:p>
-    <w:p>
-      <w:pPr/>
-      <w:r>
-        <w:rPr>
-          <w:rFonts w:ascii="Helvetica Light" w:hAnsi="Helvetica Light" w:cs="Helvetica Light"/>
-          <w:sz w:val="24"/>
-          <w:sz-cs w:val="24"/>
-        </w:rPr>
-        <w:t xml:space="preserve">你问一句，它答一句。你给它一个任务，它通常会给你一个方案、一套思路，或者一份看起来已经差不多的草稿。它当然有价值，而且价值已经很大了，但这种价值更多仍然集中在辅助决策、辅助表达和辅助判断上，而不是真正代替你进入流程、把事情做完。</w:t>
+        <w:t xml:space="preserve">写不出文案时问它，理不清思路时问它，做方案卡住时问它，连一封邮件、一段口播稿、一条朋友圈，也会先交给它润一遍。某种意义上，大模型已经成了很多人的“外脑”。它能解释概念，提供建议，辅助思考，也确实替很多人省下了不少时间。</w:t>
+      </w:r>
+    </w:p>
+    <w:p>
+      <w:pPr/>
+      <w:r>
+        <w:rPr>
+          <w:rFonts w:ascii="Helvetica Light" w:hAnsi="Helvetica Light" w:cs="Helvetica Light"/>
+          <w:sz w:val="24"/>
+          <w:sz-cs w:val="24"/>
+        </w:rPr>
+        <w:t xml:space="preserve"/>
+      </w:r>
+    </w:p>
+    <w:p>
+      <w:pPr/>
+      <w:r>
+        <w:rPr>
+          <w:rFonts w:ascii="Helvetica Light" w:hAnsi="Helvetica Light" w:cs="Helvetica Light"/>
+          <w:sz w:val="24"/>
+          <w:sz-cs w:val="24"/>
+        </w:rPr>
+        <w:t xml:space="preserve">但认真看一眼就会发现，过去大多数 AI 的能力，依然主要停留在“回答”这一层。</w:t>
+      </w:r>
+    </w:p>
+    <w:p>
+      <w:pPr/>
+      <w:r>
+        <w:rPr>
+          <w:rFonts w:ascii="Helvetica Light" w:hAnsi="Helvetica Light" w:cs="Helvetica Light"/>
+          <w:sz w:val="24"/>
+          <w:sz-cs w:val="24"/>
+        </w:rPr>
+        <w:t xml:space="preserve"/>
+      </w:r>
+    </w:p>
+    <w:p>
+      <w:pPr/>
+      <w:r>
+        <w:rPr>
+          <w:rFonts w:ascii="Helvetica Light" w:hAnsi="Helvetica Light" w:cs="Helvetica Light"/>
+          <w:sz w:val="24"/>
+          <w:sz-cs w:val="24"/>
+        </w:rPr>
+        <w:t xml:space="preserve">你问一句，它答一句。你给它一个任务，它通常会给你一套思路、一份方案，或者一版看起来差不多的草稿。它当然有价值，而且价值已经很大了，但这种价值更多集中在辅助决策、辅助表达和辅助判断上，而不是真正代替你进入流程，把事情做完。</w:t>
       </w:r>
     </w:p>
     <w:p>
@@ -164,7 +164,7 @@
           <w:sz w:val="24"/>
           <w:sz-cs w:val="24"/>
         </w:rPr>
-        <w:t xml:space="preserve">它确实懂很多，也会说很多，但真正替你完成的工作，其实并没有那么多。你让它帮你做日报，它往往先根据你给的信息整理出一段更规范的文字；你让它帮你运营公众号，它可以给你选题、框架，甚至把正文也写出来；你让它帮你订机票、整理资料、归档文件，它也能告诉你应该怎么做、流程是什么、需要注意什么。</w:t>
+        <w:t xml:space="preserve">它确实懂很多，也会说很多，但真正替你完成的工作，其实并没有那么多。你让它帮你做日报，它往往只是根据你给的信息整理出一段更规范的文字；你让它帮你运营公众号，它可以给你选题、框架，甚至把正文也写出来；你让它帮你订机票、整理资料、归档文件，它也能告诉你流程是什么、该注意什么。</w:t>
       </w:r>
     </w:p>
     <w:p>
@@ -274,7 +274,7 @@
           <w:sz w:val="24"/>
           <w:sz-cs w:val="24"/>
         </w:rPr>
-        <w:t xml:space="preserve">这不是一个小升级，而是一种使用方式上的变化。</w:t>
+        <w:t xml:space="preserve">这不是一个小升级，而是一种使用方式的变化。</w:t>
       </w:r>
     </w:p>
     <w:p>
@@ -340,7 +340,7 @@
           <w:sz w:val="24"/>
           <w:sz-cs w:val="24"/>
         </w:rPr>
-        <w:t xml:space="preserve">它不再只是一个信息接口，而开始像一个可以被安排工作的数字员工。它可能还不完美，也还远没有成熟到可以包办一切，但变化已经发生了：AI 第一次从“陪你想”，往“替你做”这边走了。</w:t>
+        <w:t xml:space="preserve">它不再只是一个信息接口，而开始像一个可以被安排工作的数字员工。它当然还不完美，也远没有成熟到可以包办一切，但变化已经发生了：AI 第一次从“陪你想”，往“替你做”这边走了。</w:t>
       </w:r>
     </w:p>
     <w:p>
@@ -450,7 +450,7 @@
           <w:sz w:val="24"/>
           <w:sz-cs w:val="24"/>
         </w:rPr>
-        <w:t xml:space="preserve">因为这意味着，它不再只是一个临时调用的工具，而开始有机会成为工作系统的一部分。它不只是站在旁边给建议，而是开始真正走进流程，接走一段工作，承担一个环节，甚至在某些场景里，形成一种可以被重复使用的执行能力。</w:t>
+        <w:t xml:space="preserve">因为这意味着，它不再只是一个临时调用的工具，而开始有机会成为工作系统的一部分。它不只是站在旁边给建议，而是开始真正走进流程，接走一段工作，承担一个环节，甚至在某些场景里形成一种可以被重复使用的执行能力。</w:t>
       </w:r>
     </w:p>
     <w:p>
@@ -538,7 +538,7 @@
           <w:sz w:val="24"/>
           <w:sz-cs w:val="24"/>
         </w:rPr>
-        <w:t xml:space="preserve">这种理解不能说错，但不够准。因为真正值得关注的，从来不是某一个具体产品的名字，而是它背后代表的那种能力形态。OpenClaw 当然不是 AI 的终局，也不代表未来所有智能工具都会沿着它完全一样的路径发展。今天有 OpenClaw，明天也会有别的产品；国内已经陆续出现了 Qclaw、飞书的 Aily、KimiClaw、WorkBuddy 这一类不同方向的尝试，后面还会继续大量涌现。它们的实现方式、产品成熟度、适用场景和入口设计都不会完全一样，但它们共同指向的是一件事：AI 正在从“对话工具”变成“任务工具”。</w:t>
+        <w:t xml:space="preserve">这种理解不能说错，但不够准。因为真正值得关注的，从来不是某一个具体产品的名字，而是它背后代表的能力形态。OpenClaw 当然不是 AI 的终局，也不代表未来所有智能工具都会沿着它完全一样的路径发展。今天有 OpenClaw，明天也会有别的产品；国内已经陆续出现了 Qclaw、飞书 Aily、KimiClaw、WorkBuddy 这一类不同方向的尝试，后面还会继续大量涌现。它们的实现方式、成熟度、适用场景和产品入口都不会完全一样，但它们共同指向的是一件事：AI 正在从“对话工具”变成“任务工具”。</w:t>
       </w:r>
     </w:p>
     <w:p>
@@ -978,7 +978,7 @@
           <w:sz w:val="24"/>
           <w:sz-cs w:val="24"/>
         </w:rPr>
-        <w:t xml:space="preserve">未来 AI 的竞争，未必只是模型参数、回答速度、生成效果的竞争，更可能是：谁更懂任务，谁更会调用工具，谁更能进入流程，谁更能和人的工作协同，谁更能长期积累记忆与经验，谁更能在具体场景里稳定地交付结果。</w:t>
+        <w:t xml:space="preserve">未来 AI 的竞争，未必只是模型参数、回答速度、生成效果的竞争，更可能是：谁更懂任务，谁更会调用工具，谁更能进入流程，谁更能和人的工作协同，谁更能长期积累记忆与经验，谁更能在具体场景里稳定交付结果。</w:t>
       </w:r>
     </w:p>
     <w:p>
@@ -1352,7 +1352,7 @@
           <w:sz w:val="24"/>
           <w:sz-cs w:val="24"/>
         </w:rPr>
-        <w:t xml:space="preserve">这些技能并不神秘，本质上就是把高频、重复、可复制的工作流程，整理成标准化能力。比如选题、抓取信息、整理日报、生成初稿、排版发布、数据回收，这些动作原本就是很多工作里的日常流程，只是以前一直靠人去做。现在，当这些流程被固化成 Skill，OpenClaw 才真正拥有了“岗位能力”。</w:t>
+        <w:t xml:space="preserve">这些技能并不神秘，本质上就是把高频、重复、可复制的工作流程整理成标准化能力。比如选题、抓取信息、整理日报、生成初稿、排版发布、数据回收，这些动作原本就是很多工作里的日常流程，只是以前一直靠人去做。现在，当这些流程被固化成 Skill，OpenClaw 才真正拥有了“岗位能力”。</w:t>
       </w:r>
     </w:p>
     <w:p>
@@ -2210,7 +2210,7 @@
           <w:sz w:val="24"/>
           <w:sz-cs w:val="24"/>
         </w:rPr>
-        <w:t xml:space="preserve">在记忆有没有被养出来，在 Skill 有没有被装进去，在规则有没有被配清楚，在问题出现之后有没有持续纠错。只有这些东西都开始运转，OpenClaw 才会从一个“看起来很强的新工具”，慢慢变成一个真正能替你工作的系统。</w:t>
+        <w:t xml:space="preserve">在记忆有没有被养出来、Skill 有没有被装进去、规则有没有被配清楚、问题出现之后有没有持续纠错。只有这些东西都开始运转，OpenClaw 才会从一个“看起来很强的新工具”，慢慢变成一个真正能替你工作的系统。</w:t>
       </w:r>
     </w:p>
     <w:p>
@@ -2496,7 +2496,7 @@
           <w:sz w:val="24"/>
           <w:sz-cs w:val="24"/>
         </w:rPr>
-        <w:t xml:space="preserve">它不再只是一个工具在单打独斗，而开始更像一个真正的数字团队。每个角色只做自己最适合的那部分事，流程也会比单个角色硬扛更稳定，出错之后更容易定位问题，优化的时候也更清楚到底该改哪一段。</w:t>
+        <w:t xml:space="preserve">它不再只是一个工具在单打独斗，而开始更像一个真正的数字团队。每个角色只做自己最适合的那部分事，流程会比单个角色硬扛更稳定，出错之后也更容易定位问题，优化的时候更清楚到底该改哪一段。</w:t>
       </w:r>
     </w:p>
     <w:p>
@@ -3728,29 +3728,29 @@
           <w:sz w:val="24"/>
           <w:sz-cs w:val="24"/>
         </w:rPr>
-        <w:t xml:space="preserve">比如，它在帮你做工作的过程中，如果出了错，它会先把错误记录下来，再去寻找更合适的改进办法。你不喜欢它犯第二次同样的错误，它就会把这些经验写进自己的文档、记忆和规则里。久而久之，很多东西你不需要重复说第二遍，它自己就会避免再踩同样的坑。</w:t>
-      </w:r>
-    </w:p>
-    <w:p>
-      <w:pPr/>
-      <w:r>
-        <w:rPr>
-          <w:rFonts w:ascii="Helvetica Light" w:hAnsi="Helvetica Light" w:cs="Helvetica Light"/>
-          <w:sz w:val="24"/>
-          <w:sz-cs w:val="24"/>
-        </w:rPr>
-        <w:t xml:space="preserve"/>
-      </w:r>
-    </w:p>
-    <w:p>
-      <w:pPr/>
-      <w:r>
-        <w:rPr>
-          <w:rFonts w:ascii="Helvetica Light" w:hAnsi="Helvetica Light" w:cs="Helvetica Light"/>
-          <w:sz w:val="24"/>
-          <w:sz-cs w:val="24"/>
-        </w:rPr>
-        <w:t xml:space="preserve">更进一步，有些问题甚至不一定是你主动指出的。你可能只是无意识地反复强调同一件事，但它能从这些重复里识别出来：这个地方可能说明我哪里没做到位，需要主动调整。也就是说，它不只是被动等待你批评，而是开始具备某种模式识别和自我修正的能力。</w:t>
+        <w:t xml:space="preserve">比如，它在帮你做工作的过程中如果出了错，会先把错误记录下来，再去寻找更合适的改进办法。你不喜欢它犯第二次同样的错误，它就会把这些经验写进自己的文档、记忆和规则里。久而久之，很多东西你不需要重复说第二遍，它自己就会避免再踩同样的坑。</w:t>
+      </w:r>
+    </w:p>
+    <w:p>
+      <w:pPr/>
+      <w:r>
+        <w:rPr>
+          <w:rFonts w:ascii="Helvetica Light" w:hAnsi="Helvetica Light" w:cs="Helvetica Light"/>
+          <w:sz w:val="24"/>
+          <w:sz-cs w:val="24"/>
+        </w:rPr>
+        <w:t xml:space="preserve"/>
+      </w:r>
+    </w:p>
+    <w:p>
+      <w:pPr/>
+      <w:r>
+        <w:rPr>
+          <w:rFonts w:ascii="Helvetica Light" w:hAnsi="Helvetica Light" w:cs="Helvetica Light"/>
+          <w:sz w:val="24"/>
+          <w:sz-cs w:val="24"/>
+        </w:rPr>
+        <w:t xml:space="preserve">更进一步，有些问题甚至不一定是你主动指出的。你可能只是无意识地反复强调同一件事，但它能从这些重复里识别出来：这个地方可能说明我哪里没做到位，需要主动调整。也就是说，它不只是被动等你批评，而是开始具备某种模式识别和自我修正的能力。</w:t>
       </w:r>
     </w:p>
     <w:p>

</xml_diff>